<commit_message>
adding pipeline architecture figures and wilks and dots formulars
</commit_message>
<xml_diff>
--- a/LiftStats_Technical_Report.docx
+++ b/LiftStats_Technical_Report.docx
@@ -1,10 +1,11 @@
 
 <file path=word/document.xml><?xml version="1.0" encoding="utf-8"?>
-<w:document xmlns:wpc="http://schemas.microsoft.com/office/word/2010/wordprocessingCanvas" xmlns:cx="http://schemas.microsoft.com/office/drawing/2014/chartex" xmlns:cx1="http://schemas.microsoft.com/office/drawing/2015/9/8/chartex" xmlns:cx2="http://schemas.microsoft.com/office/drawing/2015/10/21/chartex" xmlns:cx3="http://schemas.microsoft.com/office/drawing/2016/5/9/chartex" xmlns:cx4="http://schemas.microsoft.com/office/drawing/2016/5/10/chartex" xmlns:cx5="http://schemas.microsoft.com/office/drawing/2016/5/11/chartex" xmlns:cx6="http://schemas.microsoft.com/office/drawing/2016/5/12/chartex" xmlns:cx7="http://schemas.microsoft.com/office/drawing/2016/5/13/chartex" xmlns:cx8="http://schemas.microsoft.com/office/drawing/2016/5/14/chartex" xmlns:mc="http://schemas.openxmlformats.org/markup-compatibility/2006" xmlns:aink="http://schemas.microsoft.com/office/drawing/2016/ink" xmlns:am3d="http://schemas.microsoft.com/office/drawing/2017/model3d" xmlns:o="urn:schemas-microsoft-com:office:office" xmlns:oel="http://schemas.microsoft.com/office/2019/extlst" xmlns:r="http://schemas.openxmlformats.org/officeDocument/2006/relationships" xmlns:m="http://schemas.openxmlformats.org/officeDocument/2006/math" xmlns:v="urn:schemas-microsoft-com:vml" xmlns:wp14="http://schemas.microsoft.com/office/word/2010/wordprocessingDrawing" xmlns:wp="http://schemas.openxmlformats.org/drawingml/2006/wordprocessingDrawing" xmlns:w10="urn:schemas-microsoft-com:office:word" xmlns:w="http://schemas.openxmlformats.org/wordprocessingml/2006/main" xmlns:w14="http://schemas.microsoft.com/office/word/2010/wordml" xmlns:w15="http://schemas.microsoft.com/office/word/2012/wordml" xmlns:w16cex="http://schemas.microsoft.com/office/word/2018/wordml/cex" xmlns:w16cid="http://schemas.microsoft.com/office/word/2016/wordml/cid" xmlns:w16="http://schemas.microsoft.com/office/word/2018/wordml" xmlns:w16du="http://schemas.microsoft.com/office/word/2023/wordml/word16du" xmlns:w16sdtdh="http://schemas.microsoft.com/office/word/2020/wordml/sdtdatahash" xmlns:w16sdtfl="http://schemas.microsoft.com/office/word/2024/wordml/sdtformatlock" xmlns:w16se="http://schemas.microsoft.com/office/word/2015/wordml/symex" xmlns:wpg="http://schemas.microsoft.com/office/word/2010/wordprocessingGroup" xmlns:wpi="http://schemas.microsoft.com/office/word/2010/wordprocessingInk" xmlns:wne="http://schemas.microsoft.com/office/word/2006/wordml" xmlns:wps="http://schemas.microsoft.com/office/word/2010/wordprocessingShape" mc:Ignorable="w14 w15 w16se w16cid w16 w16cex w16sdtdh w16sdtfl w16du wp14">
+<w:document xmlns:wpc="http://schemas.microsoft.com/office/word/2010/wordprocessingCanvas" xmlns:cx="http://schemas.microsoft.com/office/drawing/2014/chartex" xmlns:cx1="http://schemas.microsoft.com/office/drawing/2015/9/8/chartex" xmlns:cx2="http://schemas.microsoft.com/office/drawing/2015/10/21/chartex" xmlns:cx3="http://schemas.microsoft.com/office/drawing/2016/5/9/chartex" xmlns:cx4="http://schemas.microsoft.com/office/drawing/2016/5/10/chartex" xmlns:cx5="http://schemas.microsoft.com/office/drawing/2016/5/11/chartex" xmlns:cx6="http://schemas.microsoft.com/office/drawing/2016/5/12/chartex" xmlns:cx7="http://schemas.microsoft.com/office/drawing/2016/5/13/chartex" xmlns:cx8="http://schemas.microsoft.com/office/drawing/2016/5/14/chartex" xmlns:mc="http://schemas.openxmlformats.org/markup-compatibility/2006" xmlns:m="http://schemas.openxmlformats.org/officeDocument/2006/math" xmlns:aink="http://schemas.microsoft.com/office/drawing/2016/ink" xmlns:am3d="http://schemas.microsoft.com/office/drawing/2017/model3d" xmlns:oel="http://schemas.microsoft.com/office/2019/extlst" xmlns:r="http://schemas.openxmlformats.org/officeDocument/2006/relationships" xmlns:wp14="http://schemas.microsoft.com/office/word/2010/wordprocessingDrawing" xmlns:wp="http://schemas.openxmlformats.org/drawingml/2006/wordprocessingDrawing" xmlns:wpg="http://schemas.microsoft.com/office/word/2010/wordprocessingGroup" xmlns:wpi="http://schemas.microsoft.com/office/word/2010/wordprocessingInk" xmlns:wps="http://schemas.microsoft.com/office/word/2010/wordprocessingShape" xmlns:o="urn:schemas-microsoft-com:office:office" xmlns:v="urn:schemas-microsoft-com:vml" xmlns:w10="urn:schemas-microsoft-com:office:word" xmlns:w="http://schemas.openxmlformats.org/wordprocessingml/2006/main" xmlns:w14="http://schemas.microsoft.com/office/word/2010/wordml" xmlns:w15="http://schemas.microsoft.com/office/word/2012/wordml" xmlns:w16cex="http://schemas.microsoft.com/office/word/2018/wordml/cex" xmlns:w16cid="http://schemas.microsoft.com/office/word/2016/wordml/cid" xmlns:w16="http://schemas.microsoft.com/office/word/2018/wordml" xmlns:w16sdtdh="http://schemas.microsoft.com/office/word/2020/wordml/sdtdatahash" xmlns:w16sdtfl="http://schemas.microsoft.com/office/word/2024/wordml/sdtformatlock" xmlns:w16se="http://schemas.microsoft.com/office/word/2015/wordml/symex" xmlns:w16du="http://schemas.microsoft.com/office/word/2023/wordml/word16du" xmlns:wne="http://schemas.microsoft.com/office/word/2006/wordml" mc:Ignorable="w14 w15 w16se w16cid w16 w16cex w16sdtdh w16sdtfl w16du wp14">
   <w:body>
     <w:p>
       <w:pPr>
-        <w:pStyle w:val="Cm"/>
+        <w:pStyle w:val="Title"/>
+        <w:jc w:val="center"/>
       </w:pPr>
       <w:proofErr w:type="spellStart"/>
       <w:r>
@@ -17,10 +18,26 @@
     </w:p>
     <w:p>
       <w:pPr>
-        <w:pStyle w:val="Alcm"/>
-      </w:pPr>
-      <w:r>
-        <w:t>Technical report · Data Science Project · October 2026</w:t>
+        <w:pStyle w:val="Subtitle"/>
+        <w:jc w:val="center"/>
+      </w:pPr>
+      <w:r>
+        <w:t xml:space="preserve">Technical report · Data Science Project · </w:t>
+      </w:r>
+      <w:r>
+        <w:t>24</w:t>
+      </w:r>
+      <w:r>
+        <w:rPr>
+          <w:vertAlign w:val="superscript"/>
+        </w:rPr>
+        <w:t>th</w:t>
+      </w:r>
+      <w:r>
+        <w:t xml:space="preserve"> </w:t>
+      </w:r>
+      <w:r>
+        <w:t>October 2026</w:t>
       </w:r>
     </w:p>
     <w:p>
@@ -29,18 +46,49 @@
           <w:bottom w:val="single" w:sz="6" w:space="4" w:color="1F3A5F"/>
         </w:pBdr>
         <w:spacing w:after="140"/>
+        <w:jc w:val="center"/>
       </w:pPr>
       <w:r>
         <w:rPr>
           <w:sz w:val="20"/>
           <w:szCs w:val="20"/>
         </w:rPr>
-        <w:t>[Group member names]</w:t>
-      </w:r>
-    </w:p>
-    <w:p>
-      <w:pPr>
-        <w:pStyle w:val="Cmsor1"/>
+        <w:t>[</w:t>
+      </w:r>
+      <w:r>
+        <w:rPr>
+          <w:sz w:val="20"/>
+          <w:szCs w:val="20"/>
+        </w:rPr>
+        <w:t xml:space="preserve">Pavlo, Gergo, </w:t>
+      </w:r>
+      <w:proofErr w:type="spellStart"/>
+      <w:r>
+        <w:rPr>
+          <w:sz w:val="20"/>
+          <w:szCs w:val="20"/>
+        </w:rPr>
+        <w:t>Zhishang</w:t>
+      </w:r>
+      <w:proofErr w:type="spellEnd"/>
+      <w:r>
+        <w:rPr>
+          <w:sz w:val="20"/>
+          <w:szCs w:val="20"/>
+        </w:rPr>
+        <w:t xml:space="preserve"> Chen</w:t>
+      </w:r>
+      <w:r>
+        <w:rPr>
+          <w:sz w:val="20"/>
+          <w:szCs w:val="20"/>
+        </w:rPr>
+        <w:t>]</w:t>
+      </w:r>
+    </w:p>
+    <w:p>
+      <w:pPr>
+        <w:pStyle w:val="Heading1"/>
         <w:keepNext/>
       </w:pPr>
       <w:r>
@@ -57,7 +105,31 @@
       </w:r>
       <w:proofErr w:type="spellEnd"/>
       <w:r>
-        <w:t xml:space="preserve"> tells a recreational lifter how their squat, bench press and deadlift compare with other lifters of the same sex, age and bodyweight, using real competition results instead of influencer “strength standards”. The web app is a thin layer on top of the data science work, which was split into three vertical slices: a percentile engine and preprocessing pipeline (Person A), a clustering model and a tested/untested transparency toggle (Person B), and a progression regression, a Wilks/DOTS toggle and a shareable result card (Person C). All three built against one locked schema (</w:t>
+        <w:t xml:space="preserve"> tells a recreational lifter how their squat, bench press</w:t>
+      </w:r>
+      <w:r>
+        <w:t>,</w:t>
+      </w:r>
+      <w:r>
+        <w:t xml:space="preserve"> and deadlift compare with other lifters of the same sex, age</w:t>
+      </w:r>
+      <w:r>
+        <w:t>,</w:t>
+      </w:r>
+      <w:r>
+        <w:t xml:space="preserve"> and body</w:t>
+      </w:r>
+      <w:r>
+        <w:t xml:space="preserve"> </w:t>
+      </w:r>
+      <w:r>
+        <w:t xml:space="preserve">weight, using real competition results instead of influencer “strength standards”. The web app is a thin layer on top of the data science work, which was split into three vertical slices: a percentile engine and preprocessing pipeline (Person A), a clustering model and a tested/untested transparency toggle (Person B), and a progression regression, a Wilks/DOTS toggle and a shareable result card (Person C). All three </w:t>
+      </w:r>
+      <w:r>
+        <w:t xml:space="preserve">were </w:t>
+      </w:r>
+      <w:r>
+        <w:t>built against one locked schema (</w:t>
       </w:r>
       <w:proofErr w:type="spellStart"/>
       <w:r>
@@ -184,7 +256,7 @@
     </w:p>
     <w:p>
       <w:pPr>
-        <w:pStyle w:val="Cmsor1"/>
+        <w:pStyle w:val="Heading1"/>
         <w:keepNext/>
       </w:pPr>
       <w:r>
@@ -215,7 +287,13 @@
         <w:t>download_data.py</w:t>
       </w:r>
       <w:r>
-        <w:t xml:space="preserve"> fetches it and the raw file is kept untouched in </w:t>
+        <w:t xml:space="preserve"> fetches it</w:t>
+      </w:r>
+      <w:r>
+        <w:t>,</w:t>
+      </w:r>
+      <w:r>
+        <w:t xml:space="preserve"> and the raw file is kept untouched in </w:t>
       </w:r>
       <w:r>
         <w:rPr>
@@ -287,7 +365,7 @@
     </w:p>
     <w:p>
       <w:pPr>
-        <w:pStyle w:val="Cmsor1"/>
+        <w:pStyle w:val="Heading1"/>
         <w:keepNext/>
       </w:pPr>
       <w:r>
@@ -317,15 +395,13 @@
         <w:t>1,560,406</w:t>
       </w:r>
       <w:r>
-        <w:t xml:space="preserve"> clean rows in about 40 seconds. It filters on equipment, event and placing (valid, successful results), </w:t>
-      </w:r>
-      <w:proofErr w:type="gramStart"/>
-      <w:r>
-        <w:t>parses</w:t>
-      </w:r>
-      <w:proofErr w:type="gramEnd"/>
-      <w:r>
-        <w:t xml:space="preserve"> negative values (failed attempts are stored as negative numbers), imputes missing ages and derives age brackets, and removes anomalies such as incomplete full-power entries and unrealistic totals. It also computes </w:t>
+        <w:t xml:space="preserve"> clean rows in about 40 seconds. It filters on equipment, event</w:t>
+      </w:r>
+      <w:r>
+        <w:t>,</w:t>
+      </w:r>
+      <w:r>
+        <w:t xml:space="preserve"> and placing (valid, successful results), parses negative values (failed attempts are stored as negative numbers), imputes missing ages and derives age brackets, and removes anomalies such as incomplete full-power entries and unrealistic totals. It also computes </w:t>
       </w:r>
       <w:r>
         <w:rPr>
@@ -372,13 +448,455 @@
       <w:pPr>
         <w:spacing w:after="90" w:line="254" w:lineRule="auto"/>
       </w:pPr>
-      <w:r>
-        <w:t>The data mix federations, which complicates bucketing. The same weight class appears under different labels (82.5 vs 83 kg) and there are rare fractional labels (e.g. 69.8, 70.3). Downstream code therefore treats a label as a real class only if it holds at least 0.3% of a sex’s rows, and merges classes within 1 kg of each other.</w:t>
-      </w:r>
-    </w:p>
-    <w:p>
-      <w:pPr>
-        <w:pStyle w:val="Cmsor1"/>
+      <m:oMathPara>
+        <m:oMath>
+          <m:r>
+            <w:rPr>
+              <w:rFonts w:ascii="Cambria Math" w:hAnsi="Cambria Math"/>
+            </w:rPr>
+            <m:t>Wilks score=total lifted</m:t>
+          </m:r>
+          <m:d>
+            <m:dPr>
+              <m:ctrlPr>
+                <w:rPr>
+                  <w:rFonts w:ascii="Cambria Math" w:hAnsi="Cambria Math"/>
+                  <w:i/>
+                </w:rPr>
+              </m:ctrlPr>
+            </m:dPr>
+            <m:e>
+              <m:r>
+                <w:rPr>
+                  <w:rFonts w:ascii="Cambria Math" w:hAnsi="Cambria Math"/>
+                </w:rPr>
+                <m:t>kg</m:t>
+              </m:r>
+            </m:e>
+          </m:d>
+          <m:r>
+            <w:rPr>
+              <w:rFonts w:ascii="Cambria Math" w:hAnsi="Cambria Math"/>
+            </w:rPr>
+            <m:t>*</m:t>
+          </m:r>
+          <m:f>
+            <m:fPr>
+              <m:ctrlPr>
+                <w:rPr>
+                  <w:rFonts w:ascii="Cambria Math" w:hAnsi="Cambria Math"/>
+                  <w:i/>
+                </w:rPr>
+              </m:ctrlPr>
+            </m:fPr>
+            <m:num>
+              <m:r>
+                <w:rPr>
+                  <w:rFonts w:ascii="Cambria Math" w:hAnsi="Cambria Math"/>
+                </w:rPr>
+                <m:t>500</m:t>
+              </m:r>
+            </m:num>
+            <m:den>
+              <m:r>
+                <w:rPr>
+                  <w:rFonts w:ascii="Cambria Math" w:hAnsi="Cambria Math"/>
+                </w:rPr>
+                <m:t>a+bx+c</m:t>
+              </m:r>
+              <m:sSup>
+                <m:sSupPr>
+                  <m:ctrlPr>
+                    <w:rPr>
+                      <w:rFonts w:ascii="Cambria Math" w:hAnsi="Cambria Math"/>
+                      <w:i/>
+                    </w:rPr>
+                  </m:ctrlPr>
+                </m:sSupPr>
+                <m:e>
+                  <m:r>
+                    <w:rPr>
+                      <w:rFonts w:ascii="Cambria Math" w:hAnsi="Cambria Math"/>
+                    </w:rPr>
+                    <m:t>x</m:t>
+                  </m:r>
+                </m:e>
+                <m:sup>
+                  <m:r>
+                    <w:rPr>
+                      <w:rFonts w:ascii="Cambria Math" w:hAnsi="Cambria Math"/>
+                    </w:rPr>
+                    <m:t>2</m:t>
+                  </m:r>
+                </m:sup>
+              </m:sSup>
+              <m:r>
+                <w:rPr>
+                  <w:rFonts w:ascii="Cambria Math" w:hAnsi="Cambria Math"/>
+                </w:rPr>
+                <m:t>+d</m:t>
+              </m:r>
+              <m:sSup>
+                <m:sSupPr>
+                  <m:ctrlPr>
+                    <w:rPr>
+                      <w:rFonts w:ascii="Cambria Math" w:hAnsi="Cambria Math"/>
+                      <w:i/>
+                    </w:rPr>
+                  </m:ctrlPr>
+                </m:sSupPr>
+                <m:e>
+                  <m:r>
+                    <w:rPr>
+                      <w:rFonts w:ascii="Cambria Math" w:hAnsi="Cambria Math"/>
+                    </w:rPr>
+                    <m:t>x</m:t>
+                  </m:r>
+                </m:e>
+                <m:sup>
+                  <m:r>
+                    <w:rPr>
+                      <w:rFonts w:ascii="Cambria Math" w:hAnsi="Cambria Math"/>
+                    </w:rPr>
+                    <m:t>3</m:t>
+                  </m:r>
+                </m:sup>
+              </m:sSup>
+              <m:r>
+                <w:rPr>
+                  <w:rFonts w:ascii="Cambria Math" w:hAnsi="Cambria Math"/>
+                </w:rPr>
+                <m:t>+e</m:t>
+              </m:r>
+              <m:sSup>
+                <m:sSupPr>
+                  <m:ctrlPr>
+                    <w:rPr>
+                      <w:rFonts w:ascii="Cambria Math" w:hAnsi="Cambria Math"/>
+                      <w:i/>
+                    </w:rPr>
+                  </m:ctrlPr>
+                </m:sSupPr>
+                <m:e>
+                  <m:r>
+                    <w:rPr>
+                      <w:rFonts w:ascii="Cambria Math" w:hAnsi="Cambria Math"/>
+                    </w:rPr>
+                    <m:t>x</m:t>
+                  </m:r>
+                </m:e>
+                <m:sup>
+                  <m:r>
+                    <w:rPr>
+                      <w:rFonts w:ascii="Cambria Math" w:hAnsi="Cambria Math"/>
+                    </w:rPr>
+                    <m:t>4</m:t>
+                  </m:r>
+                </m:sup>
+              </m:sSup>
+              <m:r>
+                <w:rPr>
+                  <w:rFonts w:ascii="Cambria Math" w:hAnsi="Cambria Math"/>
+                </w:rPr>
+                <m:t>+f</m:t>
+              </m:r>
+              <m:sSup>
+                <m:sSupPr>
+                  <m:ctrlPr>
+                    <w:rPr>
+                      <w:rFonts w:ascii="Cambria Math" w:hAnsi="Cambria Math"/>
+                      <w:i/>
+                    </w:rPr>
+                  </m:ctrlPr>
+                </m:sSupPr>
+                <m:e>
+                  <m:r>
+                    <w:rPr>
+                      <w:rFonts w:ascii="Cambria Math" w:hAnsi="Cambria Math"/>
+                    </w:rPr>
+                    <m:t>x</m:t>
+                  </m:r>
+                </m:e>
+                <m:sup>
+                  <m:r>
+                    <w:rPr>
+                      <w:rFonts w:ascii="Cambria Math" w:hAnsi="Cambria Math"/>
+                    </w:rPr>
+                    <m:t>5</m:t>
+                  </m:r>
+                </m:sup>
+              </m:sSup>
+              <m:r>
+                <w:rPr>
+                  <w:rFonts w:ascii="Cambria Math" w:hAnsi="Cambria Math"/>
+                </w:rPr>
+                <m:t xml:space="preserve"> </m:t>
+              </m:r>
+            </m:den>
+          </m:f>
+        </m:oMath>
+      </m:oMathPara>
+    </w:p>
+    <w:p>
+      <w:pPr>
+        <w:spacing w:after="90" w:line="254" w:lineRule="auto"/>
+      </w:pPr>
+      <m:oMathPara>
+        <m:oMath>
+          <m:r>
+            <w:rPr>
+              <w:rFonts w:ascii="Cambria Math" w:hAnsi="Cambria Math"/>
+            </w:rPr>
+            <m:t>DOTS score=to</m:t>
+          </m:r>
+          <m:r>
+            <w:rPr>
+              <w:rFonts w:ascii="Cambria Math" w:hAnsi="Cambria Math"/>
+            </w:rPr>
+            <m:t>tal lifted</m:t>
+          </m:r>
+          <m:d>
+            <m:dPr>
+              <m:ctrlPr>
+                <w:rPr>
+                  <w:rFonts w:ascii="Cambria Math" w:hAnsi="Cambria Math"/>
+                  <w:i/>
+                </w:rPr>
+              </m:ctrlPr>
+            </m:dPr>
+            <m:e>
+              <m:r>
+                <w:rPr>
+                  <w:rFonts w:ascii="Cambria Math" w:hAnsi="Cambria Math"/>
+                </w:rPr>
+                <m:t>kg</m:t>
+              </m:r>
+            </m:e>
+          </m:d>
+          <m:r>
+            <w:rPr>
+              <w:rFonts w:ascii="Cambria Math" w:hAnsi="Cambria Math"/>
+            </w:rPr>
+            <m:t>*</m:t>
+          </m:r>
+          <m:f>
+            <m:fPr>
+              <m:ctrlPr>
+                <w:rPr>
+                  <w:rFonts w:ascii="Cambria Math" w:hAnsi="Cambria Math"/>
+                  <w:i/>
+                </w:rPr>
+              </m:ctrlPr>
+            </m:fPr>
+            <m:num>
+              <m:r>
+                <w:rPr>
+                  <w:rFonts w:ascii="Cambria Math" w:hAnsi="Cambria Math"/>
+                </w:rPr>
+                <m:t>500</m:t>
+              </m:r>
+            </m:num>
+            <m:den>
+              <m:r>
+                <w:rPr>
+                  <w:rFonts w:ascii="Cambria Math" w:hAnsi="Cambria Math"/>
+                </w:rPr>
+                <m:t>a+bx+c</m:t>
+              </m:r>
+              <m:sSup>
+                <m:sSupPr>
+                  <m:ctrlPr>
+                    <w:rPr>
+                      <w:rFonts w:ascii="Cambria Math" w:hAnsi="Cambria Math"/>
+                      <w:i/>
+                    </w:rPr>
+                  </m:ctrlPr>
+                </m:sSupPr>
+                <m:e>
+                  <m:r>
+                    <w:rPr>
+                      <w:rFonts w:ascii="Cambria Math" w:hAnsi="Cambria Math"/>
+                    </w:rPr>
+                    <m:t>x</m:t>
+                  </m:r>
+                </m:e>
+                <m:sup>
+                  <m:r>
+                    <w:rPr>
+                      <w:rFonts w:ascii="Cambria Math" w:hAnsi="Cambria Math"/>
+                    </w:rPr>
+                    <m:t>2</m:t>
+                  </m:r>
+                </m:sup>
+              </m:sSup>
+              <m:r>
+                <w:rPr>
+                  <w:rFonts w:ascii="Cambria Math" w:hAnsi="Cambria Math"/>
+                </w:rPr>
+                <m:t>+d</m:t>
+              </m:r>
+              <m:sSup>
+                <m:sSupPr>
+                  <m:ctrlPr>
+                    <w:rPr>
+                      <w:rFonts w:ascii="Cambria Math" w:hAnsi="Cambria Math"/>
+                      <w:i/>
+                    </w:rPr>
+                  </m:ctrlPr>
+                </m:sSupPr>
+                <m:e>
+                  <m:r>
+                    <w:rPr>
+                      <w:rFonts w:ascii="Cambria Math" w:hAnsi="Cambria Math"/>
+                    </w:rPr>
+                    <m:t>x</m:t>
+                  </m:r>
+                </m:e>
+                <m:sup>
+                  <m:r>
+                    <w:rPr>
+                      <w:rFonts w:ascii="Cambria Math" w:hAnsi="Cambria Math"/>
+                    </w:rPr>
+                    <m:t>3</m:t>
+                  </m:r>
+                </m:sup>
+              </m:sSup>
+              <m:r>
+                <w:rPr>
+                  <w:rFonts w:ascii="Cambria Math" w:hAnsi="Cambria Math"/>
+                </w:rPr>
+                <m:t>+e</m:t>
+              </m:r>
+              <m:sSup>
+                <m:sSupPr>
+                  <m:ctrlPr>
+                    <w:rPr>
+                      <w:rFonts w:ascii="Cambria Math" w:hAnsi="Cambria Math"/>
+                      <w:i/>
+                    </w:rPr>
+                  </m:ctrlPr>
+                </m:sSupPr>
+                <m:e>
+                  <m:r>
+                    <w:rPr>
+                      <w:rFonts w:ascii="Cambria Math" w:hAnsi="Cambria Math"/>
+                    </w:rPr>
+                    <m:t>x</m:t>
+                  </m:r>
+                </m:e>
+                <m:sup>
+                  <m:r>
+                    <w:rPr>
+                      <w:rFonts w:ascii="Cambria Math" w:hAnsi="Cambria Math"/>
+                    </w:rPr>
+                    <m:t>4</m:t>
+                  </m:r>
+                </m:sup>
+              </m:sSup>
+              <m:r>
+                <w:rPr>
+                  <w:rFonts w:ascii="Cambria Math" w:hAnsi="Cambria Math"/>
+                </w:rPr>
+                <m:t xml:space="preserve"> </m:t>
+              </m:r>
+            </m:den>
+          </m:f>
+          <m:r>
+            <w:rPr>
+              <w:rFonts w:ascii="Cambria Math" w:hAnsi="Cambria Math"/>
+            </w:rPr>
+            <m:t xml:space="preserve"> </m:t>
+          </m:r>
+        </m:oMath>
+      </m:oMathPara>
+    </w:p>
+    <w:p>
+      <w:pPr>
+        <w:spacing w:after="90" w:line="254" w:lineRule="auto"/>
+      </w:pPr>
+      <w:r>
+        <w:t>The data mix federations, which complicates bucketing. The same weight class appears under different labels (82.5 vs 83 kg)</w:t>
+      </w:r>
+      <w:r>
+        <w:t>,</w:t>
+      </w:r>
+      <w:r>
+        <w:t xml:space="preserve"> and there are rare fractional labels (e.g. 69.8, 70.3). Downstream code therefore treats a label as a real class only if it holds at least 0.3% of a sex’s rows, and merges classes within 1 kg of each other.</w:t>
+      </w:r>
+    </w:p>
+    <w:p>
+      <w:pPr>
+        <w:spacing w:after="90" w:line="254" w:lineRule="auto"/>
+        <w:jc w:val="center"/>
+      </w:pPr>
+      <w:r>
+        <w:lastRenderedPageBreak/>
+        <w:drawing>
+          <wp:inline distT="0" distB="0" distL="0" distR="0" wp14:anchorId="3B4A4D47" wp14:editId="4231F064">
+            <wp:extent cx="5358427" cy="5999871"/>
+            <wp:effectExtent l="0" t="0" r="1270" b="0"/>
+            <wp:docPr id="1694801856" name="Picture 1"/>
+            <wp:cNvGraphicFramePr>
+              <a:graphicFrameLocks xmlns:a="http://schemas.openxmlformats.org/drawingml/2006/main" noChangeAspect="1"/>
+            </wp:cNvGraphicFramePr>
+            <a:graphic xmlns:a="http://schemas.openxmlformats.org/drawingml/2006/main">
+              <a:graphicData uri="http://schemas.openxmlformats.org/drawingml/2006/picture">
+                <pic:pic xmlns:pic="http://schemas.openxmlformats.org/drawingml/2006/picture">
+                  <pic:nvPicPr>
+                    <pic:cNvPr id="1694801856" name=""/>
+                    <pic:cNvPicPr/>
+                  </pic:nvPicPr>
+                  <pic:blipFill rotWithShape="1">
+                    <a:blip r:embed="rId7"/>
+                    <a:srcRect t="4488" b="4364"/>
+                    <a:stretch>
+                      <a:fillRect/>
+                    </a:stretch>
+                  </pic:blipFill>
+                  <pic:spPr bwMode="auto">
+                    <a:xfrm>
+                      <a:off x="0" y="0"/>
+                      <a:ext cx="5405333" cy="6052392"/>
+                    </a:xfrm>
+                    <a:prstGeom prst="rect">
+                      <a:avLst/>
+                    </a:prstGeom>
+                    <a:ln>
+                      <a:noFill/>
+                    </a:ln>
+                    <a:extLst>
+                      <a:ext uri="{53640926-AAD7-44D8-BBD7-CCE9431645EC}">
+                        <a14:shadowObscured xmlns:a14="http://schemas.microsoft.com/office/drawing/2010/main"/>
+                      </a:ext>
+                    </a:extLst>
+                  </pic:spPr>
+                </pic:pic>
+              </a:graphicData>
+            </a:graphic>
+          </wp:inline>
+        </w:drawing>
+      </w:r>
+    </w:p>
+    <w:p>
+      <w:pPr>
+        <w:spacing w:after="90" w:line="254" w:lineRule="auto"/>
+        <w:jc w:val="center"/>
+      </w:pPr>
+      <w:r>
+        <w:t xml:space="preserve">Figure1: </w:t>
+      </w:r>
+      <w:proofErr w:type="spellStart"/>
+      <w:r>
+        <w:t>LiftStats</w:t>
+      </w:r>
+      <w:proofErr w:type="spellEnd"/>
+      <w:r>
+        <w:t xml:space="preserve"> end-to-end data and application pipeline</w:t>
+      </w:r>
+    </w:p>
+    <w:p>
+      <w:pPr>
+        <w:pStyle w:val="Heading1"/>
         <w:keepNext/>
       </w:pPr>
       <w:r>
@@ -498,11 +1016,10 @@
     </w:p>
     <w:p>
       <w:pPr>
-        <w:pStyle w:val="Cmsor1"/>
+        <w:pStyle w:val="Heading1"/>
         <w:keepNext/>
       </w:pPr>
       <w:r>
-        <w:lastRenderedPageBreak/>
         <w:t>5. Machine learning</w:t>
       </w:r>
     </w:p>
@@ -516,7 +1033,7 @@
     </w:p>
     <w:p>
       <w:pPr>
-        <w:pStyle w:val="Cmsor2"/>
+        <w:pStyle w:val="Heading2"/>
         <w:keepNext/>
       </w:pPr>
       <w:r>
@@ -553,7 +1070,11 @@
         <w:t>one row per lifter</w:t>
       </w:r>
       <w:r>
-        <w:t xml:space="preserve"> (their best total), otherwise frequent competitors would dominate the clusters. Filters remove rows where the lifts do not add up to the total (±2.5 kg), where total/bodyweight exceeds 11, or where any lift is under 10% or over 60% of the three-lift sum. This leaves 350,994 lifters (240,335 men, 110,593 women).</w:t>
+        <w:t xml:space="preserve"> (their best total), otherwise frequent competitors would dominate the clusters. Filters remove rows where the lifts do not add up to the total (±2.5 kg), where </w:t>
+      </w:r>
+      <w:r>
+        <w:lastRenderedPageBreak/>
+        <w:t>total/bodyweight exceeds 11, or where any lift is under 10% or over 60% of the three-lift sum. This leaves 350,994 lifters (240,335 men, 110,593 women).</w:t>
       </w:r>
     </w:p>
     <w:p>
@@ -565,65 +1086,61 @@
           <w:b/>
           <w:bCs/>
         </w:rPr>
-        <w:t xml:space="preserve">Features and </w:t>
+        <w:t>Features and model.</w:t>
+      </w:r>
+      <w:r>
+        <w:t xml:space="preserve"> Each lift is expressed as a share of the three-lift sum (for example 35% / 23% / 42%), so the model sees the shape of a lifter’s strength and not its size. Shares are </w:t>
+      </w:r>
+      <w:proofErr w:type="spellStart"/>
+      <w:r>
+        <w:t>standardised</w:t>
+      </w:r>
+      <w:proofErr w:type="spellEnd"/>
+      <w:r>
+        <w:t xml:space="preserve"> and clustered with k-means (20 </w:t>
+      </w:r>
+      <w:proofErr w:type="spellStart"/>
+      <w:r>
+        <w:t>initialisations</w:t>
+      </w:r>
+      <w:proofErr w:type="spellEnd"/>
+      <w:r>
+        <w:t xml:space="preserve">, fixed seed). We computed inertia (elbow method) and the silhouette score for k = 2…8, the latter on a random sample of 20,000 lifters because it scales </w:t>
       </w:r>
       <w:proofErr w:type="gramStart"/>
+      <w:r>
+        <w:t>quadratically, and</w:t>
+      </w:r>
+      <w:proofErr w:type="gramEnd"/>
+      <w:r>
+        <w:t xml:space="preserve"> chose the best silhouette within k = 3–6, a range we considered interpretable. The task is unsupervised, so there is no accuracy metric; quality is judged by silhouette and by whether the clusters make sense.</w:t>
+      </w:r>
+    </w:p>
+    <w:p>
+      <w:pPr>
+        <w:spacing w:after="90" w:line="254" w:lineRule="auto"/>
+      </w:pPr>
       <w:r>
         <w:rPr>
           <w:b/>
           <w:bCs/>
         </w:rPr>
-        <w:t>model</w:t>
-      </w:r>
-      <w:proofErr w:type="gramEnd"/>
-      <w:r>
-        <w:rPr>
-          <w:b/>
-          <w:bCs/>
-        </w:rPr>
-        <w:t>.</w:t>
-      </w:r>
-      <w:r>
-        <w:t xml:space="preserve"> Each lift is expressed as a share of the three-lift sum (for example 35% / 23% / 42%), so the model sees the shape of a lifter’s strength and not its size. Shares are </w:t>
-      </w:r>
-      <w:proofErr w:type="spellStart"/>
-      <w:r>
-        <w:t>standardised</w:t>
-      </w:r>
-      <w:proofErr w:type="spellEnd"/>
-      <w:r>
-        <w:t xml:space="preserve"> and clustered with k-means (20 </w:t>
-      </w:r>
-      <w:proofErr w:type="spellStart"/>
-      <w:r>
-        <w:t>initialisations</w:t>
-      </w:r>
-      <w:proofErr w:type="spellEnd"/>
-      <w:r>
-        <w:t xml:space="preserve">, fixed seed). We computed inertia (elbow method) and the silhouette score for k = 2…8, the latter on a random sample of 20,000 lifters because it scales </w:t>
-      </w:r>
-      <w:proofErr w:type="gramStart"/>
-      <w:r>
-        <w:t>quadratically, and</w:t>
-      </w:r>
-      <w:proofErr w:type="gramEnd"/>
-      <w:r>
-        <w:t xml:space="preserve"> chose the best silhouette within k = 3–6, a range we considered interpretable. The task is unsupervised, so there is no accuracy metric; quality is judged by silhouette and by whether the clusters make sense.</w:t>
-      </w:r>
-    </w:p>
-    <w:p>
-      <w:pPr>
-        <w:spacing w:after="90" w:line="254" w:lineRule="auto"/>
-      </w:pPr>
-      <w:r>
-        <w:rPr>
-          <w:b/>
-          <w:bCs/>
-        </w:rPr>
         <w:t>Iteration: men and women separately.</w:t>
       </w:r>
       <w:r>
-        <w:t xml:space="preserve"> Our first model pooled everyone (k = 3, silhouette 0.32). The interpretation step exposed a flaw: one “bench-specialist” cluster was only 7% female while the other two were about 46% female, so the model had largely rediscovered that men bench relatively more than women. We therefore fit a separate scaler, k and set of centroids per sex and name each cluster relative to its own sex’s average lifter. The best silhouette was again at k = 3 (0.319 men, 0.328 women).</w:t>
+        <w:t xml:space="preserve"> Our first model pooled everyone (k = 3, silhouette 0.32). The interpretation step exposed a flaw: one “bench-specialist” cluster was only 7% female while the other two were about 46% female, so the model had largely rediscovered that men bench relatively more than women. We therefore fit a separate scaler, k</w:t>
+      </w:r>
+      <w:r>
+        <w:t>,</w:t>
+      </w:r>
+      <w:r>
+        <w:t xml:space="preserve"> and </w:t>
+      </w:r>
+      <w:r>
+        <w:t xml:space="preserve">a </w:t>
+      </w:r>
+      <w:r>
+        <w:t>set of centroids per sex and name each cluster relative to its own sex’s average lifter. The best silhouette was again at k = 3 (0.319 men, 0.328 women).</w:t>
       </w:r>
     </w:p>
     <w:p>
@@ -668,12 +1185,6 @@
         <w:gridCol w:w="1438"/>
       </w:tblGrid>
       <w:tr>
-        <w:tblPrEx>
-          <w:tblCellMar>
-            <w:top w:w="0" w:type="dxa"/>
-            <w:bottom w:w="0" w:type="dxa"/>
-          </w:tblCellMar>
-        </w:tblPrEx>
         <w:trPr>
           <w:cantSplit/>
           <w:tblHeader/>
@@ -866,12 +1377,6 @@
         </w:tc>
       </w:tr>
       <w:tr>
-        <w:tblPrEx>
-          <w:tblCellMar>
-            <w:top w:w="0" w:type="dxa"/>
-            <w:bottom w:w="0" w:type="dxa"/>
-          </w:tblCellMar>
-        </w:tblPrEx>
         <w:trPr>
           <w:cantSplit/>
         </w:trPr>
@@ -1045,12 +1550,6 @@
         </w:tc>
       </w:tr>
       <w:tr>
-        <w:tblPrEx>
-          <w:tblCellMar>
-            <w:top w:w="0" w:type="dxa"/>
-            <w:bottom w:w="0" w:type="dxa"/>
-          </w:tblCellMar>
-        </w:tblPrEx>
         <w:trPr>
           <w:cantSplit/>
         </w:trPr>
@@ -1224,12 +1723,6 @@
         </w:tc>
       </w:tr>
       <w:tr>
-        <w:tblPrEx>
-          <w:tblCellMar>
-            <w:top w:w="0" w:type="dxa"/>
-            <w:bottom w:w="0" w:type="dxa"/>
-          </w:tblCellMar>
-        </w:tblPrEx>
         <w:trPr>
           <w:cantSplit/>
         </w:trPr>
@@ -1403,12 +1896,6 @@
         </w:tc>
       </w:tr>
       <w:tr>
-        <w:tblPrEx>
-          <w:tblCellMar>
-            <w:top w:w="0" w:type="dxa"/>
-            <w:bottom w:w="0" w:type="dxa"/>
-          </w:tblCellMar>
-        </w:tblPrEx>
         <w:trPr>
           <w:cantSplit/>
         </w:trPr>
@@ -1600,12 +2087,6 @@
         </w:tc>
       </w:tr>
       <w:tr>
-        <w:tblPrEx>
-          <w:tblCellMar>
-            <w:top w:w="0" w:type="dxa"/>
-            <w:bottom w:w="0" w:type="dxa"/>
-          </w:tblCellMar>
-        </w:tblPrEx>
         <w:trPr>
           <w:cantSplit/>
         </w:trPr>
@@ -1779,12 +2260,6 @@
         </w:tc>
       </w:tr>
       <w:tr>
-        <w:tblPrEx>
-          <w:tblCellMar>
-            <w:top w:w="0" w:type="dxa"/>
-            <w:bottom w:w="0" w:type="dxa"/>
-          </w:tblCellMar>
-        </w:tblPrEx>
         <w:trPr>
           <w:cantSplit/>
         </w:trPr>
@@ -1958,12 +2433,6 @@
         </w:tc>
       </w:tr>
       <w:tr>
-        <w:tblPrEx>
-          <w:tblCellMar>
-            <w:top w:w="0" w:type="dxa"/>
-            <w:bottom w:w="0" w:type="dxa"/>
-          </w:tblCellMar>
-        </w:tblPrEx>
         <w:trPr>
           <w:cantSplit/>
         </w:trPr>
@@ -2137,12 +2606,6 @@
         </w:tc>
       </w:tr>
       <w:tr>
-        <w:tblPrEx>
-          <w:tblCellMar>
-            <w:top w:w="0" w:type="dxa"/>
-            <w:bottom w:w="0" w:type="dxa"/>
-          </w:tblCellMar>
-        </w:tblPrEx>
         <w:trPr>
           <w:cantSplit/>
         </w:trPr>
@@ -2382,7 +2845,7 @@
     </w:p>
     <w:p>
       <w:pPr>
-        <w:pStyle w:val="Cmsor2"/>
+        <w:pStyle w:val="Heading2"/>
         <w:keepNext/>
       </w:pPr>
       <w:r>
@@ -2420,11 +2883,10 @@
     </w:p>
     <w:p>
       <w:pPr>
-        <w:pStyle w:val="Cmsor1"/>
+        <w:pStyle w:val="Heading1"/>
         <w:keepNext/>
       </w:pPr>
       <w:r>
-        <w:lastRenderedPageBreak/>
         <w:t>6. Transparency features</w:t>
       </w:r>
     </w:p>
@@ -2440,7 +2902,13 @@
         <w:t>Tested vs untested toggle.</w:t>
       </w:r>
       <w:r>
-        <w:t xml:space="preserve"> Untested federations do not screen for performance-enhancing drugs, so the answer to “how strong am I?” depends on who is in the comparison group. This is a methodological choice, and the app exposes it. The toggle is descriptive statistics, not a model. For the user’s peer group (same sex, age bracket and weight class) it asks the percentile engine for the same lift three times with </w:t>
+        <w:t xml:space="preserve"> Untested federations do not screen for performance-enhancing drugs, so the answer to “how strong am I?” depends on who is in the comparison group. This is a methodological choice, and the app exposes it. The toggle is descriptive statistics, not a model. For the user’s peer group (same sex, age bracket and weight class)</w:t>
+      </w:r>
+      <w:r>
+        <w:t>,</w:t>
+      </w:r>
+      <w:r>
+        <w:t xml:space="preserve"> it asks the percentile engine for the same lift three times with </w:t>
       </w:r>
       <w:proofErr w:type="spellStart"/>
       <w:r>
@@ -2453,7 +2921,11 @@
       </w:r>
       <w:proofErr w:type="spellEnd"/>
       <w:r>
-        <w:t xml:space="preserve"> set to None (everyone), True (tested only) and False (untested only), and returns all three results in one response, so the buttons switch instantly on the client. A percentile is shown only if the group has at least 50 lifters, and a rule-based sentence explains the direction and size of the shift.</w:t>
+        <w:t xml:space="preserve"> set to None (everyone), True (tested only) and False (untested only), and returns all three results in one response, so the buttons switch </w:t>
+      </w:r>
+      <w:r>
+        <w:lastRenderedPageBreak/>
+        <w:t>instantly on the client. A percentile is shown only if the group has at least 50 lifters, and a rule-based sentence explains the direction and size of the shift.</w:t>
       </w:r>
     </w:p>
     <w:p>
@@ -2508,7 +2980,7 @@
     </w:p>
     <w:p>
       <w:pPr>
-        <w:pStyle w:val="Cmsor1"/>
+        <w:pStyle w:val="Heading1"/>
         <w:keepNext/>
       </w:pPr>
       <w:r>
@@ -2578,12 +3050,6 @@
         <w:gridCol w:w="2738"/>
       </w:tblGrid>
       <w:tr>
-        <w:tblPrEx>
-          <w:tblCellMar>
-            <w:top w:w="0" w:type="dxa"/>
-            <w:bottom w:w="0" w:type="dxa"/>
-          </w:tblCellMar>
-        </w:tblPrEx>
         <w:trPr>
           <w:cantSplit/>
           <w:tblHeader/>
@@ -2706,12 +3172,6 @@
         </w:tc>
       </w:tr>
       <w:tr>
-        <w:tblPrEx>
-          <w:tblCellMar>
-            <w:top w:w="0" w:type="dxa"/>
-            <w:bottom w:w="0" w:type="dxa"/>
-          </w:tblCellMar>
-        </w:tblPrEx>
         <w:trPr>
           <w:cantSplit/>
         </w:trPr>
@@ -2821,12 +3281,6 @@
         </w:tc>
       </w:tr>
       <w:tr>
-        <w:tblPrEx>
-          <w:tblCellMar>
-            <w:top w:w="0" w:type="dxa"/>
-            <w:bottom w:w="0" w:type="dxa"/>
-          </w:tblCellMar>
-        </w:tblPrEx>
         <w:trPr>
           <w:cantSplit/>
         </w:trPr>
@@ -2936,12 +3390,6 @@
         </w:tc>
       </w:tr>
       <w:tr>
-        <w:tblPrEx>
-          <w:tblCellMar>
-            <w:top w:w="0" w:type="dxa"/>
-            <w:bottom w:w="0" w:type="dxa"/>
-          </w:tblCellMar>
-        </w:tblPrEx>
         <w:trPr>
           <w:cantSplit/>
         </w:trPr>
@@ -3051,12 +3499,6 @@
         </w:tc>
       </w:tr>
       <w:tr>
-        <w:tblPrEx>
-          <w:tblCellMar>
-            <w:top w:w="0" w:type="dxa"/>
-            <w:bottom w:w="0" w:type="dxa"/>
-          </w:tblCellMar>
-        </w:tblPrEx>
         <w:trPr>
           <w:cantSplit/>
         </w:trPr>
@@ -3155,32 +3597,17 @@
             </w:tcMar>
           </w:tcPr>
           <w:p>
-            <w:proofErr w:type="gramStart"/>
-            <w:r>
-              <w:rPr>
-                <w:sz w:val="19"/>
-                <w:szCs w:val="19"/>
-              </w:rPr>
-              <w:t>Next-year</w:t>
-            </w:r>
-            <w:proofErr w:type="gramEnd"/>
-            <w:r>
-              <w:rPr>
-                <w:sz w:val="19"/>
-                <w:szCs w:val="19"/>
-              </w:rPr>
-              <w:t xml:space="preserve"> gain range</w:t>
+            <w:r>
+              <w:rPr>
+                <w:sz w:val="19"/>
+                <w:szCs w:val="19"/>
+              </w:rPr>
+              <w:t>Next-year gain range</w:t>
             </w:r>
           </w:p>
         </w:tc>
       </w:tr>
       <w:tr>
-        <w:tblPrEx>
-          <w:tblCellMar>
-            <w:top w:w="0" w:type="dxa"/>
-            <w:bottom w:w="0" w:type="dxa"/>
-          </w:tblCellMar>
-        </w:tblPrEx>
         <w:trPr>
           <w:cantSplit/>
         </w:trPr>
@@ -3329,7 +3756,7 @@
     </w:p>
     <w:p>
       <w:pPr>
-        <w:pStyle w:val="Cmsor1"/>
+        <w:pStyle w:val="Heading1"/>
         <w:keepNext/>
       </w:pPr>
       <w:r>
@@ -3366,7 +3793,7 @@
     </w:p>
     <w:p>
       <w:pPr>
-        <w:pStyle w:val="Listaszerbekezds"/>
+        <w:pStyle w:val="ListParagraph"/>
         <w:numPr>
           <w:ilvl w:val="0"/>
           <w:numId w:val="2"/>
@@ -3379,7 +3806,7 @@
     </w:p>
     <w:p>
       <w:pPr>
-        <w:pStyle w:val="Listaszerbekezds"/>
+        <w:pStyle w:val="ListParagraph"/>
         <w:numPr>
           <w:ilvl w:val="0"/>
           <w:numId w:val="2"/>
@@ -3387,20 +3814,12 @@
         <w:spacing w:after="50" w:line="254" w:lineRule="auto"/>
       </w:pPr>
       <w:r>
-        <w:t>The silhouette stayed flat, so no k is “</w:t>
-      </w:r>
-      <w:proofErr w:type="gramStart"/>
-      <w:r>
-        <w:t>correct</w:t>
-      </w:r>
-      <w:proofErr w:type="gramEnd"/>
-      <w:r>
-        <w:t>”; we had hoped for clearer archetypes, and the honest outcome is a weak result.</w:t>
-      </w:r>
-    </w:p>
-    <w:p>
-      <w:pPr>
-        <w:pStyle w:val="Listaszerbekezds"/>
+        <w:t>The silhouette stayed flat, so no k is “correct”; we had hoped for clearer archetypes, and the honest outcome is a weak result.</w:t>
+      </w:r>
+    </w:p>
+    <w:p>
+      <w:pPr>
+        <w:pStyle w:val="ListParagraph"/>
         <w:numPr>
           <w:ilvl w:val="0"/>
           <w:numId w:val="2"/>
@@ -3413,7 +3832,7 @@
     </w:p>
     <w:p>
       <w:pPr>
-        <w:pStyle w:val="Listaszerbekezds"/>
+        <w:pStyle w:val="ListParagraph"/>
         <w:numPr>
           <w:ilvl w:val="0"/>
           <w:numId w:val="2"/>
@@ -3426,7 +3845,7 @@
     </w:p>
     <w:p>
       <w:pPr>
-        <w:pStyle w:val="Listaszerbekezds"/>
+        <w:pStyle w:val="ListParagraph"/>
         <w:numPr>
           <w:ilvl w:val="0"/>
           <w:numId w:val="2"/>
@@ -3455,13 +3874,12 @@
           <w:b/>
           <w:bCs/>
         </w:rPr>
-        <w:lastRenderedPageBreak/>
         <w:t>Changes from the initial plan.</w:t>
       </w:r>
     </w:p>
     <w:p>
       <w:pPr>
-        <w:pStyle w:val="Listaszerbekezds"/>
+        <w:pStyle w:val="ListParagraph"/>
         <w:numPr>
           <w:ilvl w:val="0"/>
           <w:numId w:val="2"/>
@@ -3474,7 +3892,7 @@
     </w:p>
     <w:p>
       <w:pPr>
-        <w:pStyle w:val="Listaszerbekezds"/>
+        <w:pStyle w:val="ListParagraph"/>
         <w:numPr>
           <w:ilvl w:val="0"/>
           <w:numId w:val="2"/>
@@ -3482,12 +3900,18 @@
         <w:spacing w:after="50" w:line="254" w:lineRule="auto"/>
       </w:pPr>
       <w:r>
-        <w:t>Survivorship bias became a design constraint: the regression uses only lifters with 3+ meets and the limitation is stated in the report.</w:t>
-      </w:r>
-    </w:p>
-    <w:p>
-      <w:pPr>
-        <w:pStyle w:val="Listaszerbekezds"/>
+        <w:t>Survivorship bias became a design constraint: the regression uses only lifters with 3+ meets</w:t>
+      </w:r>
+      <w:r>
+        <w:t>,</w:t>
+      </w:r>
+      <w:r>
+        <w:t xml:space="preserve"> and the limitation is stated in the report.</w:t>
+      </w:r>
+    </w:p>
+    <w:p>
+      <w:pPr>
+        <w:pStyle w:val="ListParagraph"/>
         <w:numPr>
           <w:ilvl w:val="0"/>
           <w:numId w:val="2"/>
@@ -3495,12 +3919,13 @@
         <w:spacing w:after="50" w:line="254" w:lineRule="auto"/>
       </w:pPr>
       <w:r>
+        <w:lastRenderedPageBreak/>
         <w:t>Peer groups use real weight-class limits and merge federation-equivalent classes, instead of the planned IPF classes or 5 kg bands, because the data mix federations.</w:t>
       </w:r>
     </w:p>
     <w:p>
       <w:pPr>
-        <w:pStyle w:val="Listaszerbekezds"/>
+        <w:pStyle w:val="ListParagraph"/>
         <w:numPr>
           <w:ilvl w:val="0"/>
           <w:numId w:val="2"/>
@@ -3529,7 +3954,7 @@
     </w:p>
     <w:p>
       <w:pPr>
-        <w:pStyle w:val="Listaszerbekezds"/>
+        <w:pStyle w:val="ListParagraph"/>
         <w:numPr>
           <w:ilvl w:val="0"/>
           <w:numId w:val="2"/>
@@ -3568,7 +3993,13 @@
       </w:r>
       <w:proofErr w:type="gramEnd"/>
       <w:r>
-        <w:t xml:space="preserve"> add small automated checks: scoring formulas against the dataset’s own Wilks/DOTS columns, schema assertions on the cleaned file and a smoke test per API route. We would evaluate the regression against a naive baseline (predict the median gain), align user-facing wording such as “training age” with what the model measures (years since the first meet), and start integrating the screens earlier than the final week.</w:t>
+        <w:t xml:space="preserve"> add small automated checks: scoring formulas against the dataset’s own Wilks/DOTS columns, schema assertions on the cleaned file</w:t>
+      </w:r>
+      <w:r>
+        <w:t>,</w:t>
+      </w:r>
+      <w:r>
+        <w:t xml:space="preserve"> and a smoke test per API route. We would evaluate the regression against a naive baseline (predict the median gain), align user-facing wording such as “training age” with what the model measures (years since the first meet), and start integrating the screens earlier than the final week.</w:t>
       </w:r>
     </w:p>
     <w:p>
@@ -3591,7 +4022,13 @@
       </w:r>
       <w:proofErr w:type="spellEnd"/>
       <w:r>
-        <w:t xml:space="preserve">) Show how clearly a user belongs to an archetype (distance to the nearest versus the second-nearest centroid), making the weak separation visible instead of hiding it. (ii) Improve the progression model with sex as a feature, a polynomial or quantile-regression variant and empirical prediction intervals, trained on gaps of about 12 months between meets to match the question the app answers. (iii) Add a clearly labelled recreational benchmark from published strength standards, or a small survey, to address the competitor-only bias. (iv) Rebuild the pipeline automatically for each new </w:t>
+        <w:t>) Show how clearly a user belongs to an archetype (distance to the nearest versus the second-nearest centroid), making the weak separation visible instead of hiding it. (ii) Improve the progression model with sex as a feature, a polynomial or quantile-regression variant</w:t>
+      </w:r>
+      <w:r>
+        <w:t>,</w:t>
+      </w:r>
+      <w:r>
+        <w:t xml:space="preserve"> and empirical prediction intervals, trained on gaps of about 12 months between meets to match the question the app answers. (iii) Add a clearly labelled recreational benchmark from published strength standards, or a small survey, to address the competitor-only bias. (iv) Rebuild the pipeline automatically for each new </w:t>
       </w:r>
       <w:proofErr w:type="spellStart"/>
       <w:r>
@@ -3614,21 +4051,13 @@
         <w:t>Learning outcomes.</w:t>
       </w:r>
       <w:r>
-        <w:t xml:space="preserve"> Technically, we learned to process a multi-million-row dataset end to end (788 MB raw to 1.56 million clean rows in about 40 seconds), to separate unsupervised work (judged by silhouette and interpretability) from supervised work (judged on held-out lifters, split by lifter to avoid leakage), and to treat a weak result as a finding and not a failure. Methodologically, the survivorship and competitor-only biases showed that a clean pipeline can still answer a slightly different question than the one </w:t>
-      </w:r>
-      <w:proofErr w:type="gramStart"/>
-      <w:r>
-        <w:t>users</w:t>
-      </w:r>
-      <w:proofErr w:type="gramEnd"/>
-      <w:r>
-        <w:t xml:space="preserve"> ask, and that the honest response is to say so in the interface. As a team, schema contracts, a shared context file and code review were worth more than any single clever model.</w:t>
+        <w:t xml:space="preserve"> Technically, we learned to process a multi-million-row dataset end to end (788 MB raw to 1.56 million clean rows in about 40 seconds), to separate unsupervised work (judged by silhouette and interpretability) from supervised work (judged on held-out lifters, split by lifter to avoid leakage), and to treat a weak result as a finding and not a failure. Methodologically, the survivorship and competitor-only biases showed that a clean pipeline can still answer a slightly different question than the one users ask, and that the honest response is to say so in the interface. As a team, schema contracts, a shared context file and code review were worth more than any single clever model.</w:t>
       </w:r>
     </w:p>
     <w:sectPr>
-      <w:footerReference w:type="default" r:id="rId7"/>
+      <w:footerReference w:type="default" r:id="rId8"/>
       <w:pgSz w:w="11906" w:h="16838"/>
-      <w:pgMar w:top="1020" w:right="1134" w:bottom="1020" w:left="1134" w:header="708" w:footer="708" w:gutter="0"/>
+      <w:pgMar w:top="1440" w:right="1080" w:bottom="1440" w:left="1080" w:header="708" w:footer="708" w:gutter="0"/>
       <w:cols w:space="720"/>
       <w:docGrid w:linePitch="360"/>
     </w:sectPr>
@@ -3637,7 +4066,7 @@
 </file>
 
 <file path=word/endnotes.xml><?xml version="1.0" encoding="utf-8"?>
-<w:endnotes xmlns:wpc="http://schemas.microsoft.com/office/word/2010/wordprocessingCanvas" xmlns:cx="http://schemas.microsoft.com/office/drawing/2014/chartex" xmlns:cx1="http://schemas.microsoft.com/office/drawing/2015/9/8/chartex" xmlns:cx2="http://schemas.microsoft.com/office/drawing/2015/10/21/chartex" xmlns:cx3="http://schemas.microsoft.com/office/drawing/2016/5/9/chartex" xmlns:cx4="http://schemas.microsoft.com/office/drawing/2016/5/10/chartex" xmlns:cx5="http://schemas.microsoft.com/office/drawing/2016/5/11/chartex" xmlns:cx6="http://schemas.microsoft.com/office/drawing/2016/5/12/chartex" xmlns:cx7="http://schemas.microsoft.com/office/drawing/2016/5/13/chartex" xmlns:cx8="http://schemas.microsoft.com/office/drawing/2016/5/14/chartex" xmlns:mc="http://schemas.openxmlformats.org/markup-compatibility/2006" xmlns:aink="http://schemas.microsoft.com/office/drawing/2016/ink" xmlns:am3d="http://schemas.microsoft.com/office/drawing/2017/model3d" xmlns:o="urn:schemas-microsoft-com:office:office" xmlns:oel="http://schemas.microsoft.com/office/2019/extlst" xmlns:r="http://schemas.openxmlformats.org/officeDocument/2006/relationships" xmlns:m="http://schemas.openxmlformats.org/officeDocument/2006/math" xmlns:v="urn:schemas-microsoft-com:vml" xmlns:wp14="http://schemas.microsoft.com/office/word/2010/wordprocessingDrawing" xmlns:wp="http://schemas.openxmlformats.org/drawingml/2006/wordprocessingDrawing" xmlns:w10="urn:schemas-microsoft-com:office:word" xmlns:w="http://schemas.openxmlformats.org/wordprocessingml/2006/main" xmlns:w14="http://schemas.microsoft.com/office/word/2010/wordml" xmlns:w15="http://schemas.microsoft.com/office/word/2012/wordml" xmlns:w16cex="http://schemas.microsoft.com/office/word/2018/wordml/cex" xmlns:w16cid="http://schemas.microsoft.com/office/word/2016/wordml/cid" xmlns:w16="http://schemas.microsoft.com/office/word/2018/wordml" xmlns:w16du="http://schemas.microsoft.com/office/word/2023/wordml/word16du" xmlns:w16sdtdh="http://schemas.microsoft.com/office/word/2020/wordml/sdtdatahash" xmlns:w16sdtfl="http://schemas.microsoft.com/office/word/2024/wordml/sdtformatlock" xmlns:w16se="http://schemas.microsoft.com/office/word/2015/wordml/symex" xmlns:wpg="http://schemas.microsoft.com/office/word/2010/wordprocessingGroup" xmlns:wpi="http://schemas.microsoft.com/office/word/2010/wordprocessingInk" xmlns:wne="http://schemas.microsoft.com/office/word/2006/wordml" xmlns:wps="http://schemas.microsoft.com/office/word/2010/wordprocessingShape" mc:Ignorable="w14 w15 w16se w16cid w16 w16cex w16sdtdh w16sdtfl w16du wp14">
+<w:endnotes xmlns:wpc="http://schemas.microsoft.com/office/word/2010/wordprocessingCanvas" xmlns:cx="http://schemas.microsoft.com/office/drawing/2014/chartex" xmlns:cx1="http://schemas.microsoft.com/office/drawing/2015/9/8/chartex" xmlns:cx2="http://schemas.microsoft.com/office/drawing/2015/10/21/chartex" xmlns:cx3="http://schemas.microsoft.com/office/drawing/2016/5/9/chartex" xmlns:cx4="http://schemas.microsoft.com/office/drawing/2016/5/10/chartex" xmlns:cx5="http://schemas.microsoft.com/office/drawing/2016/5/11/chartex" xmlns:cx6="http://schemas.microsoft.com/office/drawing/2016/5/12/chartex" xmlns:cx7="http://schemas.microsoft.com/office/drawing/2016/5/13/chartex" xmlns:cx8="http://schemas.microsoft.com/office/drawing/2016/5/14/chartex" xmlns:mc="http://schemas.openxmlformats.org/markup-compatibility/2006" xmlns:m="http://schemas.openxmlformats.org/officeDocument/2006/math" xmlns:aink="http://schemas.microsoft.com/office/drawing/2016/ink" xmlns:am3d="http://schemas.microsoft.com/office/drawing/2017/model3d" xmlns:oel="http://schemas.microsoft.com/office/2019/extlst" xmlns:r="http://schemas.openxmlformats.org/officeDocument/2006/relationships" xmlns:wp14="http://schemas.microsoft.com/office/word/2010/wordprocessingDrawing" xmlns:wp="http://schemas.openxmlformats.org/drawingml/2006/wordprocessingDrawing" xmlns:wpg="http://schemas.microsoft.com/office/word/2010/wordprocessingGroup" xmlns:wpi="http://schemas.microsoft.com/office/word/2010/wordprocessingInk" xmlns:wps="http://schemas.microsoft.com/office/word/2010/wordprocessingShape" xmlns:o="urn:schemas-microsoft-com:office:office" xmlns:v="urn:schemas-microsoft-com:vml" xmlns:w10="urn:schemas-microsoft-com:office:word" xmlns:w="http://schemas.openxmlformats.org/wordprocessingml/2006/main" xmlns:w14="http://schemas.microsoft.com/office/word/2010/wordml" xmlns:w15="http://schemas.microsoft.com/office/word/2012/wordml" xmlns:w16cex="http://schemas.microsoft.com/office/word/2018/wordml/cex" xmlns:w16cid="http://schemas.microsoft.com/office/word/2016/wordml/cid" xmlns:w16="http://schemas.microsoft.com/office/word/2018/wordml" xmlns:w16sdtdh="http://schemas.microsoft.com/office/word/2020/wordml/sdtdatahash" xmlns:w16sdtfl="http://schemas.microsoft.com/office/word/2024/wordml/sdtformatlock" xmlns:w16se="http://schemas.microsoft.com/office/word/2015/wordml/symex" xmlns:w16du="http://schemas.microsoft.com/office/word/2023/wordml/word16du" xmlns:wne="http://schemas.microsoft.com/office/word/2006/wordml" mc:Ignorable="w14 w15 w16se w16cid w16 w16cex w16sdtdh w16sdtfl w16du wp14">
   <w:endnote w:type="separator" w:id="-1">
     <w:p>
       <w:r>
@@ -3656,7 +4085,7 @@
 </file>
 
 <file path=word/footer1.xml><?xml version="1.0" encoding="utf-8"?>
-<w:ftr xmlns:wpc="http://schemas.microsoft.com/office/word/2010/wordprocessingCanvas" xmlns:cx="http://schemas.microsoft.com/office/drawing/2014/chartex" xmlns:cx1="http://schemas.microsoft.com/office/drawing/2015/9/8/chartex" xmlns:cx2="http://schemas.microsoft.com/office/drawing/2015/10/21/chartex" xmlns:cx3="http://schemas.microsoft.com/office/drawing/2016/5/9/chartex" xmlns:cx4="http://schemas.microsoft.com/office/drawing/2016/5/10/chartex" xmlns:cx5="http://schemas.microsoft.com/office/drawing/2016/5/11/chartex" xmlns:cx6="http://schemas.microsoft.com/office/drawing/2016/5/12/chartex" xmlns:cx7="http://schemas.microsoft.com/office/drawing/2016/5/13/chartex" xmlns:cx8="http://schemas.microsoft.com/office/drawing/2016/5/14/chartex" xmlns:mc="http://schemas.openxmlformats.org/markup-compatibility/2006" xmlns:aink="http://schemas.microsoft.com/office/drawing/2016/ink" xmlns:am3d="http://schemas.microsoft.com/office/drawing/2017/model3d" xmlns:o="urn:schemas-microsoft-com:office:office" xmlns:oel="http://schemas.microsoft.com/office/2019/extlst" xmlns:r="http://schemas.openxmlformats.org/officeDocument/2006/relationships" xmlns:m="http://schemas.openxmlformats.org/officeDocument/2006/math" xmlns:v="urn:schemas-microsoft-com:vml" xmlns:wp14="http://schemas.microsoft.com/office/word/2010/wordprocessingDrawing" xmlns:wp="http://schemas.openxmlformats.org/drawingml/2006/wordprocessingDrawing" xmlns:w10="urn:schemas-microsoft-com:office:word" xmlns:w="http://schemas.openxmlformats.org/wordprocessingml/2006/main" xmlns:w14="http://schemas.microsoft.com/office/word/2010/wordml" xmlns:w15="http://schemas.microsoft.com/office/word/2012/wordml" xmlns:w16cex="http://schemas.microsoft.com/office/word/2018/wordml/cex" xmlns:w16cid="http://schemas.microsoft.com/office/word/2016/wordml/cid" xmlns:w16="http://schemas.microsoft.com/office/word/2018/wordml" xmlns:w16du="http://schemas.microsoft.com/office/word/2023/wordml/word16du" xmlns:w16sdtdh="http://schemas.microsoft.com/office/word/2020/wordml/sdtdatahash" xmlns:w16sdtfl="http://schemas.microsoft.com/office/word/2024/wordml/sdtformatlock" xmlns:w16se="http://schemas.microsoft.com/office/word/2015/wordml/symex" xmlns:wpg="http://schemas.microsoft.com/office/word/2010/wordprocessingGroup" xmlns:wpi="http://schemas.microsoft.com/office/word/2010/wordprocessingInk" xmlns:wne="http://schemas.microsoft.com/office/word/2006/wordml" xmlns:wps="http://schemas.microsoft.com/office/word/2010/wordprocessingShape" mc:Ignorable="w14 w15 w16se w16cid w16 w16cex w16sdtdh w16sdtfl w16du wp14">
+<w:ftr xmlns:wpc="http://schemas.microsoft.com/office/word/2010/wordprocessingCanvas" xmlns:cx="http://schemas.microsoft.com/office/drawing/2014/chartex" xmlns:cx1="http://schemas.microsoft.com/office/drawing/2015/9/8/chartex" xmlns:cx2="http://schemas.microsoft.com/office/drawing/2015/10/21/chartex" xmlns:cx3="http://schemas.microsoft.com/office/drawing/2016/5/9/chartex" xmlns:cx4="http://schemas.microsoft.com/office/drawing/2016/5/10/chartex" xmlns:cx5="http://schemas.microsoft.com/office/drawing/2016/5/11/chartex" xmlns:cx6="http://schemas.microsoft.com/office/drawing/2016/5/12/chartex" xmlns:cx7="http://schemas.microsoft.com/office/drawing/2016/5/13/chartex" xmlns:cx8="http://schemas.microsoft.com/office/drawing/2016/5/14/chartex" xmlns:mc="http://schemas.openxmlformats.org/markup-compatibility/2006" xmlns:m="http://schemas.openxmlformats.org/officeDocument/2006/math" xmlns:aink="http://schemas.microsoft.com/office/drawing/2016/ink" xmlns:am3d="http://schemas.microsoft.com/office/drawing/2017/model3d" xmlns:oel="http://schemas.microsoft.com/office/2019/extlst" xmlns:r="http://schemas.openxmlformats.org/officeDocument/2006/relationships" xmlns:wp14="http://schemas.microsoft.com/office/word/2010/wordprocessingDrawing" xmlns:wp="http://schemas.openxmlformats.org/drawingml/2006/wordprocessingDrawing" xmlns:wpg="http://schemas.microsoft.com/office/word/2010/wordprocessingGroup" xmlns:wpi="http://schemas.microsoft.com/office/word/2010/wordprocessingInk" xmlns:wps="http://schemas.microsoft.com/office/word/2010/wordprocessingShape" xmlns:o="urn:schemas-microsoft-com:office:office" xmlns:v="urn:schemas-microsoft-com:vml" xmlns:w10="urn:schemas-microsoft-com:office:word" xmlns:w="http://schemas.openxmlformats.org/wordprocessingml/2006/main" xmlns:w14="http://schemas.microsoft.com/office/word/2010/wordml" xmlns:w15="http://schemas.microsoft.com/office/word/2012/wordml" xmlns:w16cex="http://schemas.microsoft.com/office/word/2018/wordml/cex" xmlns:w16cid="http://schemas.microsoft.com/office/word/2016/wordml/cid" xmlns:w16="http://schemas.microsoft.com/office/word/2018/wordml" xmlns:w16sdtdh="http://schemas.microsoft.com/office/word/2020/wordml/sdtdatahash" xmlns:w16sdtfl="http://schemas.microsoft.com/office/word/2024/wordml/sdtformatlock" xmlns:w16se="http://schemas.microsoft.com/office/word/2015/wordml/symex" xmlns:w16du="http://schemas.microsoft.com/office/word/2023/wordml/word16du" xmlns:wne="http://schemas.microsoft.com/office/word/2006/wordml" mc:Ignorable="w14 w15 w16se w16cid w16 w16cex w16sdtdh w16sdtfl w16du wp14">
   <w:p>
     <w:pPr>
       <w:jc w:val="center"/>
@@ -3725,7 +4154,7 @@
 </file>
 
 <file path=word/footnotes.xml><?xml version="1.0" encoding="utf-8"?>
-<w:footnotes xmlns:wpc="http://schemas.microsoft.com/office/word/2010/wordprocessingCanvas" xmlns:cx="http://schemas.microsoft.com/office/drawing/2014/chartex" xmlns:cx1="http://schemas.microsoft.com/office/drawing/2015/9/8/chartex" xmlns:cx2="http://schemas.microsoft.com/office/drawing/2015/10/21/chartex" xmlns:cx3="http://schemas.microsoft.com/office/drawing/2016/5/9/chartex" xmlns:cx4="http://schemas.microsoft.com/office/drawing/2016/5/10/chartex" xmlns:cx5="http://schemas.microsoft.com/office/drawing/2016/5/11/chartex" xmlns:cx6="http://schemas.microsoft.com/office/drawing/2016/5/12/chartex" xmlns:cx7="http://schemas.microsoft.com/office/drawing/2016/5/13/chartex" xmlns:cx8="http://schemas.microsoft.com/office/drawing/2016/5/14/chartex" xmlns:mc="http://schemas.openxmlformats.org/markup-compatibility/2006" xmlns:aink="http://schemas.microsoft.com/office/drawing/2016/ink" xmlns:am3d="http://schemas.microsoft.com/office/drawing/2017/model3d" xmlns:o="urn:schemas-microsoft-com:office:office" xmlns:oel="http://schemas.microsoft.com/office/2019/extlst" xmlns:r="http://schemas.openxmlformats.org/officeDocument/2006/relationships" xmlns:m="http://schemas.openxmlformats.org/officeDocument/2006/math" xmlns:v="urn:schemas-microsoft-com:vml" xmlns:wp14="http://schemas.microsoft.com/office/word/2010/wordprocessingDrawing" xmlns:wp="http://schemas.openxmlformats.org/drawingml/2006/wordprocessingDrawing" xmlns:w10="urn:schemas-microsoft-com:office:word" xmlns:w="http://schemas.openxmlformats.org/wordprocessingml/2006/main" xmlns:w14="http://schemas.microsoft.com/office/word/2010/wordml" xmlns:w15="http://schemas.microsoft.com/office/word/2012/wordml" xmlns:w16cex="http://schemas.microsoft.com/office/word/2018/wordml/cex" xmlns:w16cid="http://schemas.microsoft.com/office/word/2016/wordml/cid" xmlns:w16="http://schemas.microsoft.com/office/word/2018/wordml" xmlns:w16du="http://schemas.microsoft.com/office/word/2023/wordml/word16du" xmlns:w16sdtdh="http://schemas.microsoft.com/office/word/2020/wordml/sdtdatahash" xmlns:w16sdtfl="http://schemas.microsoft.com/office/word/2024/wordml/sdtformatlock" xmlns:w16se="http://schemas.microsoft.com/office/word/2015/wordml/symex" xmlns:wpg="http://schemas.microsoft.com/office/word/2010/wordprocessingGroup" xmlns:wpi="http://schemas.microsoft.com/office/word/2010/wordprocessingInk" xmlns:wne="http://schemas.microsoft.com/office/word/2006/wordml" xmlns:wps="http://schemas.microsoft.com/office/word/2010/wordprocessingShape" mc:Ignorable="w14 w15 w16se w16cid w16 w16cex w16sdtdh w16sdtfl w16du wp14">
+<w:footnotes xmlns:wpc="http://schemas.microsoft.com/office/word/2010/wordprocessingCanvas" xmlns:cx="http://schemas.microsoft.com/office/drawing/2014/chartex" xmlns:cx1="http://schemas.microsoft.com/office/drawing/2015/9/8/chartex" xmlns:cx2="http://schemas.microsoft.com/office/drawing/2015/10/21/chartex" xmlns:cx3="http://schemas.microsoft.com/office/drawing/2016/5/9/chartex" xmlns:cx4="http://schemas.microsoft.com/office/drawing/2016/5/10/chartex" xmlns:cx5="http://schemas.microsoft.com/office/drawing/2016/5/11/chartex" xmlns:cx6="http://schemas.microsoft.com/office/drawing/2016/5/12/chartex" xmlns:cx7="http://schemas.microsoft.com/office/drawing/2016/5/13/chartex" xmlns:cx8="http://schemas.microsoft.com/office/drawing/2016/5/14/chartex" xmlns:mc="http://schemas.openxmlformats.org/markup-compatibility/2006" xmlns:m="http://schemas.openxmlformats.org/officeDocument/2006/math" xmlns:aink="http://schemas.microsoft.com/office/drawing/2016/ink" xmlns:am3d="http://schemas.microsoft.com/office/drawing/2017/model3d" xmlns:oel="http://schemas.microsoft.com/office/2019/extlst" xmlns:r="http://schemas.openxmlformats.org/officeDocument/2006/relationships" xmlns:wp14="http://schemas.microsoft.com/office/word/2010/wordprocessingDrawing" xmlns:wp="http://schemas.openxmlformats.org/drawingml/2006/wordprocessingDrawing" xmlns:wpg="http://schemas.microsoft.com/office/word/2010/wordprocessingGroup" xmlns:wpi="http://schemas.microsoft.com/office/word/2010/wordprocessingInk" xmlns:wps="http://schemas.microsoft.com/office/word/2010/wordprocessingShape" xmlns:o="urn:schemas-microsoft-com:office:office" xmlns:v="urn:schemas-microsoft-com:vml" xmlns:w10="urn:schemas-microsoft-com:office:word" xmlns:w="http://schemas.openxmlformats.org/wordprocessingml/2006/main" xmlns:w14="http://schemas.microsoft.com/office/word/2010/wordml" xmlns:w15="http://schemas.microsoft.com/office/word/2012/wordml" xmlns:w16cex="http://schemas.microsoft.com/office/word/2018/wordml/cex" xmlns:w16cid="http://schemas.microsoft.com/office/word/2016/wordml/cid" xmlns:w16="http://schemas.microsoft.com/office/word/2018/wordml" xmlns:w16sdtdh="http://schemas.microsoft.com/office/word/2020/wordml/sdtdatahash" xmlns:w16sdtfl="http://schemas.microsoft.com/office/word/2024/wordml/sdtformatlock" xmlns:w16se="http://schemas.microsoft.com/office/word/2015/wordml/symex" xmlns:w16du="http://schemas.microsoft.com/office/word/2023/wordml/word16du" xmlns:wne="http://schemas.microsoft.com/office/word/2006/wordml" mc:Ignorable="w14 w15 w16se w16cid w16 w16cex w16sdtdh w16sdtfl w16du wp14">
   <w:footnote w:type="separator" w:id="-1">
     <w:p>
       <w:r>
@@ -3744,7 +4173,7 @@
 </file>
 
 <file path=word/numbering.xml><?xml version="1.0" encoding="utf-8"?>
-<w:numbering xmlns:wpc="http://schemas.microsoft.com/office/word/2010/wordprocessingCanvas" xmlns:cx="http://schemas.microsoft.com/office/drawing/2014/chartex" xmlns:cx1="http://schemas.microsoft.com/office/drawing/2015/9/8/chartex" xmlns:cx2="http://schemas.microsoft.com/office/drawing/2015/10/21/chartex" xmlns:cx3="http://schemas.microsoft.com/office/drawing/2016/5/9/chartex" xmlns:cx4="http://schemas.microsoft.com/office/drawing/2016/5/10/chartex" xmlns:cx5="http://schemas.microsoft.com/office/drawing/2016/5/11/chartex" xmlns:cx6="http://schemas.microsoft.com/office/drawing/2016/5/12/chartex" xmlns:cx7="http://schemas.microsoft.com/office/drawing/2016/5/13/chartex" xmlns:cx8="http://schemas.microsoft.com/office/drawing/2016/5/14/chartex" xmlns:mc="http://schemas.openxmlformats.org/markup-compatibility/2006" xmlns:aink="http://schemas.microsoft.com/office/drawing/2016/ink" xmlns:am3d="http://schemas.microsoft.com/office/drawing/2017/model3d" xmlns:o="urn:schemas-microsoft-com:office:office" xmlns:oel="http://schemas.microsoft.com/office/2019/extlst" xmlns:r="http://schemas.openxmlformats.org/officeDocument/2006/relationships" xmlns:m="http://schemas.openxmlformats.org/officeDocument/2006/math" xmlns:v="urn:schemas-microsoft-com:vml" xmlns:wp14="http://schemas.microsoft.com/office/word/2010/wordprocessingDrawing" xmlns:wp="http://schemas.openxmlformats.org/drawingml/2006/wordprocessingDrawing" xmlns:w10="urn:schemas-microsoft-com:office:word" xmlns:w="http://schemas.openxmlformats.org/wordprocessingml/2006/main" xmlns:w14="http://schemas.microsoft.com/office/word/2010/wordml" xmlns:w15="http://schemas.microsoft.com/office/word/2012/wordml" xmlns:w16cex="http://schemas.microsoft.com/office/word/2018/wordml/cex" xmlns:w16cid="http://schemas.microsoft.com/office/word/2016/wordml/cid" xmlns:w16="http://schemas.microsoft.com/office/word/2018/wordml" xmlns:w16du="http://schemas.microsoft.com/office/word/2023/wordml/word16du" xmlns:w16sdtdh="http://schemas.microsoft.com/office/word/2020/wordml/sdtdatahash" xmlns:w16sdtfl="http://schemas.microsoft.com/office/word/2024/wordml/sdtformatlock" xmlns:w16se="http://schemas.microsoft.com/office/word/2015/wordml/symex" xmlns:wpg="http://schemas.microsoft.com/office/word/2010/wordprocessingGroup" xmlns:wpi="http://schemas.microsoft.com/office/word/2010/wordprocessingInk" xmlns:wne="http://schemas.microsoft.com/office/word/2006/wordml" xmlns:wps="http://schemas.microsoft.com/office/word/2010/wordprocessingShape" mc:Ignorable="w14 w15 w16se w16cid w16 w16cex w16sdtdh w16sdtfl w16du wp14">
+<w:numbering xmlns:wpc="http://schemas.microsoft.com/office/word/2010/wordprocessingCanvas" xmlns:cx="http://schemas.microsoft.com/office/drawing/2014/chartex" xmlns:cx1="http://schemas.microsoft.com/office/drawing/2015/9/8/chartex" xmlns:cx2="http://schemas.microsoft.com/office/drawing/2015/10/21/chartex" xmlns:cx3="http://schemas.microsoft.com/office/drawing/2016/5/9/chartex" xmlns:cx4="http://schemas.microsoft.com/office/drawing/2016/5/10/chartex" xmlns:cx5="http://schemas.microsoft.com/office/drawing/2016/5/11/chartex" xmlns:cx6="http://schemas.microsoft.com/office/drawing/2016/5/12/chartex" xmlns:cx7="http://schemas.microsoft.com/office/drawing/2016/5/13/chartex" xmlns:cx8="http://schemas.microsoft.com/office/drawing/2016/5/14/chartex" xmlns:mc="http://schemas.openxmlformats.org/markup-compatibility/2006" xmlns:m="http://schemas.openxmlformats.org/officeDocument/2006/math" xmlns:aink="http://schemas.microsoft.com/office/drawing/2016/ink" xmlns:am3d="http://schemas.microsoft.com/office/drawing/2017/model3d" xmlns:oel="http://schemas.microsoft.com/office/2019/extlst" xmlns:r="http://schemas.openxmlformats.org/officeDocument/2006/relationships" xmlns:wp14="http://schemas.microsoft.com/office/word/2010/wordprocessingDrawing" xmlns:wp="http://schemas.openxmlformats.org/drawingml/2006/wordprocessingDrawing" xmlns:wpg="http://schemas.microsoft.com/office/word/2010/wordprocessingGroup" xmlns:wpi="http://schemas.microsoft.com/office/word/2010/wordprocessingInk" xmlns:wps="http://schemas.microsoft.com/office/word/2010/wordprocessingShape" xmlns:o="urn:schemas-microsoft-com:office:office" xmlns:v="urn:schemas-microsoft-com:vml" xmlns:w10="urn:schemas-microsoft-com:office:word" xmlns:w="http://schemas.openxmlformats.org/wordprocessingml/2006/main" xmlns:w14="http://schemas.microsoft.com/office/word/2010/wordml" xmlns:w15="http://schemas.microsoft.com/office/word/2012/wordml" xmlns:w16cex="http://schemas.microsoft.com/office/word/2018/wordml/cex" xmlns:w16cid="http://schemas.microsoft.com/office/word/2016/wordml/cid" xmlns:w16="http://schemas.microsoft.com/office/word/2018/wordml" xmlns:w16sdtdh="http://schemas.microsoft.com/office/word/2020/wordml/sdtdatahash" xmlns:w16sdtfl="http://schemas.microsoft.com/office/word/2024/wordml/sdtformatlock" xmlns:w16se="http://schemas.microsoft.com/office/word/2015/wordml/symex" xmlns:w16du="http://schemas.microsoft.com/office/word/2023/wordml/word16du" xmlns:wne="http://schemas.microsoft.com/office/word/2006/wordml" mc:Ignorable="w14 w15 w16se w16cid w16 w16cex w16sdtdh w16sdtfl w16du wp14">
   <w:abstractNum w:abstractNumId="0" w15:restartNumberingAfterBreak="0">
     <w:nsid w:val="27DD00FF"/>
     <w:multiLevelType w:val="hybridMultilevel"/>
@@ -3901,7 +4330,7 @@
 </file>
 
 <file path=word/styles.xml><?xml version="1.0" encoding="utf-8"?>
-<w:styles xmlns:mc="http://schemas.openxmlformats.org/markup-compatibility/2006" xmlns:r="http://schemas.openxmlformats.org/officeDocument/2006/relationships" xmlns:w="http://schemas.openxmlformats.org/wordprocessingml/2006/main" xmlns:w14="http://schemas.microsoft.com/office/word/2010/wordml" xmlns:w15="http://schemas.microsoft.com/office/word/2012/wordml" xmlns:w16cex="http://schemas.microsoft.com/office/word/2018/wordml/cex" xmlns:w16cid="http://schemas.microsoft.com/office/word/2016/wordml/cid" xmlns:w16="http://schemas.microsoft.com/office/word/2018/wordml" xmlns:w16du="http://schemas.microsoft.com/office/word/2023/wordml/word16du" xmlns:w16sdtdh="http://schemas.microsoft.com/office/word/2020/wordml/sdtdatahash" xmlns:w16sdtfl="http://schemas.microsoft.com/office/word/2024/wordml/sdtformatlock" xmlns:w16se="http://schemas.microsoft.com/office/word/2015/wordml/symex" mc:Ignorable="w14 w15 w16se w16cid w16 w16cex w16sdtdh w16sdtfl w16du">
+<w:styles xmlns:mc="http://schemas.openxmlformats.org/markup-compatibility/2006" xmlns:r="http://schemas.openxmlformats.org/officeDocument/2006/relationships" xmlns:w="http://schemas.openxmlformats.org/wordprocessingml/2006/main" xmlns:w14="http://schemas.microsoft.com/office/word/2010/wordml" xmlns:w15="http://schemas.microsoft.com/office/word/2012/wordml" xmlns:w16cex="http://schemas.microsoft.com/office/word/2018/wordml/cex" xmlns:w16cid="http://schemas.microsoft.com/office/word/2016/wordml/cid" xmlns:w16="http://schemas.microsoft.com/office/word/2018/wordml" xmlns:w16sdtdh="http://schemas.microsoft.com/office/word/2020/wordml/sdtdatahash" xmlns:w16sdtfl="http://schemas.microsoft.com/office/word/2024/wordml/sdtformatlock" xmlns:w16se="http://schemas.microsoft.com/office/word/2015/wordml/symex" xmlns:w16du="http://schemas.microsoft.com/office/word/2023/wordml/word16du" mc:Ignorable="w14 w15 w16se w16cid w16 w16cex w16sdtdh w16sdtfl w16du">
   <w:docDefaults>
     <w:rPrDefault>
       <w:rPr>
@@ -4291,11 +4720,11 @@
     <w:lsdException w:name="Unresolved Mention" w:semiHidden="1" w:unhideWhenUsed="1"/>
     <w:lsdException w:name="Smart Link" w:semiHidden="1" w:unhideWhenUsed="1"/>
   </w:latentStyles>
-  <w:style w:type="paragraph" w:default="1" w:styleId="Norml">
+  <w:style w:type="paragraph" w:default="1" w:styleId="Normal">
     <w:name w:val="Normal"/>
     <w:qFormat/>
   </w:style>
-  <w:style w:type="paragraph" w:styleId="Cmsor1">
+  <w:style w:type="paragraph" w:styleId="Heading1">
     <w:name w:val="heading 1"/>
     <w:uiPriority w:val="9"/>
     <w:qFormat/>
@@ -4311,7 +4740,7 @@
       <w:szCs w:val="26"/>
     </w:rPr>
   </w:style>
-  <w:style w:type="paragraph" w:styleId="Cmsor2">
+  <w:style w:type="paragraph" w:styleId="Heading2">
     <w:name w:val="heading 2"/>
     <w:uiPriority w:val="9"/>
     <w:unhideWhenUsed/>
@@ -4328,7 +4757,7 @@
       <w:szCs w:val="22"/>
     </w:rPr>
   </w:style>
-  <w:style w:type="paragraph" w:styleId="Cmsor3">
+  <w:style w:type="paragraph" w:styleId="Heading3">
     <w:name w:val="heading 3"/>
     <w:uiPriority w:val="9"/>
     <w:semiHidden/>
@@ -4343,7 +4772,7 @@
       <w:szCs w:val="24"/>
     </w:rPr>
   </w:style>
-  <w:style w:type="paragraph" w:styleId="Cmsor4">
+  <w:style w:type="paragraph" w:styleId="Heading4">
     <w:name w:val="heading 4"/>
     <w:uiPriority w:val="9"/>
     <w:semiHidden/>
@@ -4358,7 +4787,7 @@
       <w:color w:val="2E74B5"/>
     </w:rPr>
   </w:style>
-  <w:style w:type="paragraph" w:styleId="Cmsor5">
+  <w:style w:type="paragraph" w:styleId="Heading5">
     <w:name w:val="heading 5"/>
     <w:uiPriority w:val="9"/>
     <w:semiHidden/>
@@ -4371,7 +4800,7 @@
       <w:color w:val="2E74B5"/>
     </w:rPr>
   </w:style>
-  <w:style w:type="paragraph" w:styleId="Cmsor6">
+  <w:style w:type="paragraph" w:styleId="Heading6">
     <w:name w:val="heading 6"/>
     <w:uiPriority w:val="9"/>
     <w:semiHidden/>
@@ -4384,13 +4813,12 @@
       <w:color w:val="1F4D78"/>
     </w:rPr>
   </w:style>
-  <w:style w:type="character" w:default="1" w:styleId="Bekezdsalapbettpusa">
+  <w:style w:type="character" w:default="1" w:styleId="DefaultParagraphFont">
     <w:name w:val="Default Paragraph Font"/>
     <w:uiPriority w:val="1"/>
-    <w:semiHidden/>
     <w:unhideWhenUsed/>
   </w:style>
-  <w:style w:type="table" w:default="1" w:styleId="Normltblzat">
+  <w:style w:type="table" w:default="1" w:styleId="TableNormal">
     <w:name w:val="Normal Table"/>
     <w:uiPriority w:val="99"/>
     <w:semiHidden/>
@@ -4405,13 +4833,13 @@
       </w:tblCellMar>
     </w:tblPr>
   </w:style>
-  <w:style w:type="numbering" w:default="1" w:styleId="Nemlista">
+  <w:style w:type="numbering" w:default="1" w:styleId="NoList">
     <w:name w:val="No List"/>
     <w:uiPriority w:val="99"/>
     <w:semiHidden/>
     <w:unhideWhenUsed/>
   </w:style>
-  <w:style w:type="paragraph" w:styleId="Cm">
+  <w:style w:type="paragraph" w:styleId="Title">
     <w:name w:val="Title"/>
     <w:uiPriority w:val="10"/>
     <w:qFormat/>
@@ -4428,11 +4856,11 @@
       <w:bCs/>
     </w:rPr>
   </w:style>
-  <w:style w:type="paragraph" w:styleId="Listaszerbekezds">
+  <w:style w:type="paragraph" w:styleId="ListParagraph">
     <w:name w:val="List Paragraph"/>
     <w:qFormat/>
   </w:style>
-  <w:style w:type="character" w:styleId="Hiperhivatkozs">
+  <w:style w:type="character" w:styleId="Hyperlink">
     <w:name w:val="Hyperlink"/>
     <w:uiPriority w:val="99"/>
     <w:unhideWhenUsed/>
@@ -4441,7 +4869,7 @@
       <w:u w:val="single"/>
     </w:rPr>
   </w:style>
-  <w:style w:type="character" w:styleId="Lbjegyzet-hivatkozs">
+  <w:style w:type="character" w:styleId="FootnoteReference">
     <w:name w:val="footnote reference"/>
     <w:uiPriority w:val="99"/>
     <w:semiHidden/>
@@ -4450,9 +4878,9 @@
       <w:vertAlign w:val="superscript"/>
     </w:rPr>
   </w:style>
-  <w:style w:type="paragraph" w:styleId="Lbjegyzetszveg">
+  <w:style w:type="paragraph" w:styleId="FootnoteText">
     <w:name w:val="footnote text"/>
-    <w:link w:val="LbjegyzetszvegChar"/>
+    <w:link w:val="FootnoteTextChar"/>
     <w:uiPriority w:val="99"/>
     <w:semiHidden/>
     <w:unhideWhenUsed/>
@@ -4461,9 +4889,9 @@
       <w:szCs w:val="20"/>
     </w:rPr>
   </w:style>
-  <w:style w:type="character" w:customStyle="1" w:styleId="LbjegyzetszvegChar">
-    <w:name w:val="Lábjegyzetszöveg Char"/>
-    <w:link w:val="Lbjegyzetszveg"/>
+  <w:style w:type="character" w:customStyle="1" w:styleId="FootnoteTextChar">
+    <w:name w:val="Footnote Text Char"/>
+    <w:link w:val="FootnoteText"/>
     <w:uiPriority w:val="99"/>
     <w:semiHidden/>
     <w:unhideWhenUsed/>
@@ -4472,7 +4900,7 @@
       <w:szCs w:val="20"/>
     </w:rPr>
   </w:style>
-  <w:style w:type="character" w:styleId="Vgjegyzet-hivatkozs">
+  <w:style w:type="character" w:styleId="EndnoteReference">
     <w:name w:val="endnote reference"/>
     <w:uiPriority w:val="99"/>
     <w:semiHidden/>
@@ -4481,9 +4909,9 @@
       <w:vertAlign w:val="superscript"/>
     </w:rPr>
   </w:style>
-  <w:style w:type="paragraph" w:styleId="Vgjegyzetszvege">
+  <w:style w:type="paragraph" w:styleId="EndnoteText">
     <w:name w:val="endnote text"/>
-    <w:link w:val="VgjegyzetszvegeChar"/>
+    <w:link w:val="EndnoteTextChar"/>
     <w:uiPriority w:val="99"/>
     <w:semiHidden/>
     <w:unhideWhenUsed/>
@@ -4492,9 +4920,9 @@
       <w:szCs w:val="20"/>
     </w:rPr>
   </w:style>
-  <w:style w:type="character" w:customStyle="1" w:styleId="VgjegyzetszvegeChar">
-    <w:name w:val="Végjegyzet szövege Char"/>
-    <w:link w:val="Vgjegyzetszvege"/>
+  <w:style w:type="character" w:customStyle="1" w:styleId="EndnoteTextChar">
+    <w:name w:val="Endnote Text Char"/>
+    <w:link w:val="EndnoteText"/>
     <w:uiPriority w:val="99"/>
     <w:semiHidden/>
     <w:unhideWhenUsed/>
@@ -4503,11 +4931,11 @@
       <w:szCs w:val="20"/>
     </w:rPr>
   </w:style>
-  <w:style w:type="paragraph" w:styleId="Alcm">
+  <w:style w:type="paragraph" w:styleId="Subtitle">
     <w:name w:val="Subtitle"/>
-    <w:basedOn w:val="Norml"/>
-    <w:next w:val="Norml"/>
-    <w:link w:val="AlcmChar"/>
+    <w:basedOn w:val="Normal"/>
+    <w:next w:val="Normal"/>
+    <w:link w:val="SubtitleChar"/>
     <w:uiPriority w:val="11"/>
     <w:qFormat/>
     <w:rsid w:val="006146C7"/>
@@ -4525,10 +4953,10 @@
       <w:szCs w:val="22"/>
     </w:rPr>
   </w:style>
-  <w:style w:type="character" w:customStyle="1" w:styleId="AlcmChar">
-    <w:name w:val="Alcím Char"/>
-    <w:basedOn w:val="Bekezdsalapbettpusa"/>
-    <w:link w:val="Alcm"/>
+  <w:style w:type="character" w:customStyle="1" w:styleId="SubtitleChar">
+    <w:name w:val="Subtitle Char"/>
+    <w:basedOn w:val="DefaultParagraphFont"/>
+    <w:link w:val="Subtitle"/>
     <w:uiPriority w:val="11"/>
     <w:rsid w:val="006146C7"/>
     <w:rPr>
@@ -4539,10 +4967,10 @@
       <w:szCs w:val="22"/>
     </w:rPr>
   </w:style>
-  <w:style w:type="paragraph" w:styleId="lfej">
+  <w:style w:type="paragraph" w:styleId="Header">
     <w:name w:val="header"/>
-    <w:basedOn w:val="Norml"/>
-    <w:link w:val="lfejChar"/>
+    <w:basedOn w:val="Normal"/>
+    <w:link w:val="HeaderChar"/>
     <w:uiPriority w:val="99"/>
     <w:unhideWhenUsed/>
     <w:rsid w:val="006146C7"/>
@@ -4553,17 +4981,17 @@
       </w:tabs>
     </w:pPr>
   </w:style>
-  <w:style w:type="character" w:customStyle="1" w:styleId="lfejChar">
-    <w:name w:val="Élőfej Char"/>
-    <w:basedOn w:val="Bekezdsalapbettpusa"/>
-    <w:link w:val="lfej"/>
+  <w:style w:type="character" w:customStyle="1" w:styleId="HeaderChar">
+    <w:name w:val="Header Char"/>
+    <w:basedOn w:val="DefaultParagraphFont"/>
+    <w:link w:val="Header"/>
     <w:uiPriority w:val="99"/>
     <w:rsid w:val="006146C7"/>
   </w:style>
-  <w:style w:type="paragraph" w:styleId="llb">
+  <w:style w:type="paragraph" w:styleId="Footer">
     <w:name w:val="footer"/>
-    <w:basedOn w:val="Norml"/>
-    <w:link w:val="llbChar"/>
+    <w:basedOn w:val="Normal"/>
+    <w:link w:val="FooterChar"/>
     <w:uiPriority w:val="99"/>
     <w:unhideWhenUsed/>
     <w:rsid w:val="006146C7"/>
@@ -4574,12 +5002,22 @@
       </w:tabs>
     </w:pPr>
   </w:style>
-  <w:style w:type="character" w:customStyle="1" w:styleId="llbChar">
-    <w:name w:val="Élőláb Char"/>
-    <w:basedOn w:val="Bekezdsalapbettpusa"/>
-    <w:link w:val="llb"/>
+  <w:style w:type="character" w:customStyle="1" w:styleId="FooterChar">
+    <w:name w:val="Footer Char"/>
+    <w:basedOn w:val="DefaultParagraphFont"/>
+    <w:link w:val="Footer"/>
     <w:uiPriority w:val="99"/>
     <w:rsid w:val="006146C7"/>
+  </w:style>
+  <w:style w:type="character" w:styleId="PlaceholderText">
+    <w:name w:val="Placeholder Text"/>
+    <w:basedOn w:val="DefaultParagraphFont"/>
+    <w:uiPriority w:val="99"/>
+    <w:semiHidden/>
+    <w:rsid w:val="00C83C34"/>
+    <w:rPr>
+      <w:color w:val="666666"/>
+    </w:rPr>
   </w:style>
 </w:styles>
 </file>

</xml_diff>